<commit_message>
Fix ampersand legibility and experience card date alignment
- Replace literal "&" with "and" throughout the site (English copy) in
  job titles, hero tagline and stat tile; Spanish already used "y"
- Fix .experience-meta alignment: switch align-items from center to
  baseline so the period date lines up with the company name instead of
  appearing to float lower, especially noticeable when the job title
  wraps to two lines
- Switch the CV from pdflatex/Latin Modern to XeLaTeX + Georgia, matching
  the .docx master's font; drop \scshape section headers (Georgia has no
  true small-caps) in favor of bold title case
- Replace "\&" with "and" throughout the CV (titles, skill labels) for
  the same legibility reason; regenerate PDFs and .docx accordingly

Co-Authored-By: Claude Sonnet 5 <noreply@anthropic.com>
</commit_message>
<xml_diff>
--- a/cv/Francisco-Martinez-Fenoll-CV-ESP.docx
+++ b/cv/Francisco-Martinez-Fenoll-CV-ESP.docx
@@ -60,7 +60,7 @@
         </w:rPr>
         <w:t xml:space="preserve">  •  </w:t>
       </w:r>
-      <w:hyperlink w:history="1" r:id="rId8jymfk8ammcqcoebpuwm7">
+      <w:hyperlink w:history="1" r:id="rIdrbbnq1ywocwtkm9y460xv">
         <w:r>
           <w:rPr>
             <w:rFonts w:ascii="Georgia" w:cs="Georgia" w:eastAsia="Georgia" w:hAnsi="Georgia"/>
@@ -98,7 +98,7 @@
         </w:rPr>
         <w:t xml:space="preserve">  •  </w:t>
       </w:r>
-      <w:hyperlink w:history="1" r:id="rIddvywv3cnhpkinuyzwytnl">
+      <w:hyperlink w:history="1" r:id="rIds7gtusu7pagsb17lfsc9f">
         <w:r>
           <w:rPr>
             <w:rFonts w:ascii="Georgia" w:cs="Georgia" w:eastAsia="Georgia" w:hAnsi="Georgia"/>
@@ -118,7 +118,7 @@
         </w:rPr>
         <w:t xml:space="preserve">  •  </w:t>
       </w:r>
-      <w:hyperlink w:history="1" r:id="rIdg0hjjjdw1mclomjqoydkb">
+      <w:hyperlink w:history="1" r:id="rIdnmgsyodm0tv6awfp-uesl">
         <w:r>
           <w:rPr>
             <w:rFonts w:ascii="Georgia" w:cs="Georgia" w:eastAsia="Georgia" w:hAnsi="Georgia"/>
@@ -676,7 +676,7 @@
         </w:numPr>
         <w:spacing w:after="50" w:line="268"/>
       </w:pPr>
-      <w:hyperlink w:history="1" r:id="rId8kotqwgxldoancqqpne91">
+      <w:hyperlink w:history="1" r:id="rIdksv10ddjn0v0kqk4ud5mq">
         <w:r>
           <w:rPr>
             <w:rFonts w:ascii="Georgia" w:cs="Georgia" w:eastAsia="Georgia" w:hAnsi="Georgia"/>
@@ -704,7 +704,7 @@
         </w:numPr>
         <w:spacing w:after="50" w:line="268"/>
       </w:pPr>
-      <w:hyperlink w:history="1" r:id="rIdichwf1nll9oechxykixw9">
+      <w:hyperlink w:history="1" r:id="rIdne9z9f7rfcuusir6vbi8j">
         <w:r>
           <w:rPr>
             <w:rFonts w:ascii="Georgia" w:cs="Georgia" w:eastAsia="Georgia" w:hAnsi="Georgia"/>
@@ -732,7 +732,7 @@
         </w:numPr>
         <w:spacing w:after="50" w:line="268"/>
       </w:pPr>
-      <w:hyperlink w:history="1" r:id="rIdbz2-ipdv0rmswveg7i6ib">
+      <w:hyperlink w:history="1" r:id="rIdwm1krongyd6swtwlte905">
         <w:r>
           <w:rPr>
             <w:rFonts w:ascii="Georgia" w:cs="Georgia" w:eastAsia="Georgia" w:hAnsi="Georgia"/>
@@ -760,7 +760,7 @@
         </w:numPr>
         <w:spacing w:after="50" w:line="268"/>
       </w:pPr>
-      <w:hyperlink w:history="1" r:id="rIdw6lxm_jm-b8-oaxvbxsej">
+      <w:hyperlink w:history="1" r:id="rId8kertkkrfobawrcwqrkje">
         <w:r>
           <w:rPr>
             <w:rFonts w:ascii="Georgia" w:cs="Georgia" w:eastAsia="Georgia" w:hAnsi="Georgia"/>
@@ -788,7 +788,7 @@
         </w:numPr>
         <w:spacing w:after="50" w:line="268"/>
       </w:pPr>
-      <w:hyperlink w:history="1" r:id="rIddeccooihxkmhj-5jtckju">
+      <w:hyperlink w:history="1" r:id="rIdi2pr0s9fhwumfk2ekk9o_">
         <w:r>
           <w:rPr>
             <w:rFonts w:ascii="Georgia" w:cs="Georgia" w:eastAsia="Georgia" w:hAnsi="Georgia"/>
@@ -816,7 +816,7 @@
         </w:numPr>
         <w:spacing w:after="50" w:line="268"/>
       </w:pPr>
-      <w:hyperlink w:history="1" r:id="rIdjilftj0vmpnuhagoahvwu">
+      <w:hyperlink w:history="1" r:id="rIdtdqn2pg_rurdwdkr6se9t">
         <w:r>
           <w:rPr>
             <w:rFonts w:ascii="Georgia" w:cs="Georgia" w:eastAsia="Georgia" w:hAnsi="Georgia"/>

</xml_diff>